<commit_message>
Article 3 v2: drop the 'what the law does not support' section
Per the author: the three negative checks are compressed into one
discussion paragraph (mechanism of the amplitude geography = future
work); abstract, tasks and conclusions renumbered. 25.2k characters.

Co-Authored-By: Claude Fable 5.1 <noreply@anthropic.com>
</commit_message>
<xml_diff>
--- a/manuscript_v2/article3/article3_v2.docx
+++ b/manuscript_v2/article3/article3_v2.docx
@@ -109,7 +109,7 @@
           <w:rFonts w:ascii="Times New Roman" w:hAnsi="Times New Roman"/>
           <w:sz w:val="24"/>
         </w:rPr>
-        <w:t xml:space="preserve">Атмосферная циркуляция устроена как иерархия: внутри циклонов и антициклонов размером в тысячи километров живут вихри в сотни километров, а внутри них – вихри в десятки километров. В двух предыдущих статьях серии показано, что согласованность размещения соседних уровней этой иерархии (сопряженность уровней) – устойчивая характеристика территории, и построена ее планетарная карта. Цель настоящей работы – установить, по какому правилу связаны между собой уровни иерархии, и дать карте сопряженности единое объяснение. По полю относительного вихря на поверхности 850 гПа (реанализ ERA5, 2023–2024 гг.) для двенадцати областей размером 2000 на 2800 км и для 902 ячеек планетарной сетки измерена согласованность размещения всех пар уровней от 50 до 1600 км сверх той, что задана спектром поля. Найден простой закон: согласованность двух уровней зависит только от более крупного из них и не зависит от того, насколько мелок второй. Иначе говоря, каждый крупный уровень передает один и тот же рисунок размещения всем уровням ниже себя. Закон выполняется во всех 902 ячейках, не зависит от размера области и от режима циркуляции и воспроизводится в модельном расчете без усвоения наблюдений, то есть отражает свойство атмосферы. Сопряженность соседних уровней оказывается нормированной силой этого наследования. Территории различаются не устройством иерархии, которое везде одно, а силой наследования; ее карта и есть карта сопряженности. Показано, какие более сильные утверждения – о глубине наследования, о его механизме и о балансе унаследованной и собственной изменчивости – данными не подтверждаются. Закон дает планетарной карте единое основание и позволяет использовать ее в районировании как характеристику устройства циркуляции.</w:t>
+        <w:t xml:space="preserve">Атмосферная циркуляция устроена как иерархия: внутри циклонов и антициклонов размером в тысячи километров живут вихри в сотни километров, а внутри них – вихри в десятки километров. В двух предыдущих статьях серии показано, что согласованность размещения соседних уровней этой иерархии (сопряженность уровней) – устойчивая характеристика территории, и построена ее планетарная карта. Цель настоящей работы – установить, по какому правилу связаны между собой уровни иерархии, и дать карте сопряженности единое объяснение. По полю относительного вихря на поверхности 850 гПа (реанализ ERA5, 2023–2024 гг.) для двенадцати областей размером 2000 на 2800 км и для 902 ячеек планетарной сетки измерена согласованность размещения всех пар уровней от 50 до 1600 км сверх той, что задана спектром поля. Найден простой закон: согласованность двух уровней зависит только от более крупного из них и не зависит от того, насколько мелок второй. Иначе говоря, каждый крупный уровень передает один и тот же рисунок размещения всем уровням ниже себя. Закон выполняется во всех 902 ячейках, не зависит от размера области и от режима циркуляции и воспроизводится в модельном расчете без усвоения наблюдений, то есть отражает свойство атмосферы. Сопряженность соседних уровней оказывается нормированной силой этого наследования. Территории различаются не устройством иерархии, которое везде одно, а силой наследования; ее карта и есть карта сопряженности. Закон дает планетарной карте единое основание и позволяет использовать ее в районировании как характеристику устройства циркуляции.</w:t>
       </w:r>
     </w:p>
     <w:p>
@@ -352,7 +352,7 @@
           <w:rFonts w:ascii="Times New Roman" w:hAnsi="Times New Roman"/>
           <w:sz w:val="24"/>
         </w:rPr>
-        <w:t xml:space="preserve">следует из найденного правила; (4) проверить более сильные утверждения, которые напрашиваются из правила, и отделить подтвержденные от неподтвержденных; (5) сформулировать, что найденный закон дает районированию.</w:t>
+        <w:t xml:space="preserve">следует из найденного правила; (4) сформулировать, что найденный закон дает районированию.</w:t>
       </w:r>
     </w:p>
     <w:bookmarkEnd w:id="10"/>
@@ -636,7 +636,7 @@
       </w:r>
     </w:p>
     <w:bookmarkEnd w:id="11"/>
-    <w:bookmarkStart w:id="17" w:name="результаты-исследования"/>
+    <w:bookmarkStart w:id="16" w:name="результаты-исследования"/>
     <w:p>
       <w:pPr>
         <w:pStyle w:val="Heading1"/>
@@ -1850,7 +1850,7 @@
           <w:rFonts w:ascii="Times New Roman" w:hAnsi="Times New Roman"/>
           <w:sz w:val="24"/>
         </w:rPr>
-        <w:t xml:space="preserve">примерно вдвое меньше правой части: суррогатная поправка вычитает корреляцию случайно-фазовых полей, у которых разброс огибающих меньше, чем у наблюденных, и потому вычитает несколько больше нужного. Это сжатие одинаково по всем территориям и на ранжирование не влияет; попытка описать его точной формулой по медианным значениям не удалась (наклон 0.38 вместо единицы) и в дальнейшем не используется. По надежности карты</w:t>
+        <w:t xml:space="preserve">примерно вдвое меньше правой части: суррогатная поправка вычитает корреляцию случайно-фазовых полей, у которых разброс огибающих меньше, чем у наблюденных, и потому вычитает несколько больше нужного. Это сжатие одинаково по всем территориям и на ранжирование не влияет. По надежности карты</w:t>
       </w:r>
       <w:r>
         <w:rPr>
@@ -2220,7 +2220,21 @@
       </w:r>
     </w:p>
     <w:bookmarkEnd w:id="15"/>
-    <w:bookmarkStart w:id="16" w:name="что-закон-не-подтверждает"/>
+    <w:bookmarkEnd w:id="16"/>
+    <w:bookmarkStart w:id="21" w:name="обсуждение-результатов"/>
+    <w:p>
+      <w:pPr>
+        <w:pStyle w:val="Heading1"/>
+      </w:pPr>
+      <w:r>
+        <w:rPr>
+          <w:rFonts w:ascii="Times New Roman" w:hAnsi="Times New Roman"/>
+          <w:sz w:val="24"/>
+        </w:rPr>
+        <w:t xml:space="preserve">ОБСУЖДЕНИЕ РЕЗУЛЬТАТОВ</w:t>
+      </w:r>
+    </w:p>
+    <w:bookmarkStart w:id="17" w:name="единое-объяснение-карты"/>
     <w:p>
       <w:pPr>
         <w:pStyle w:val="Heading2"/>
@@ -2230,7 +2244,7 @@
           <w:rFonts w:ascii="Times New Roman" w:hAnsi="Times New Roman"/>
           <w:sz w:val="24"/>
         </w:rPr>
-        <w:t xml:space="preserve">Что закон не подтверждает</w:t>
+        <w:t xml:space="preserve">Единое объяснение карты</w:t>
       </w:r>
     </w:p>
     <w:p>
@@ -2242,7 +2256,33 @@
           <w:rFonts w:ascii="Times New Roman" w:hAnsi="Times New Roman"/>
           <w:sz w:val="24"/>
         </w:rPr>
-        <w:t xml:space="preserve">Из закона напрашиваются три более сильных утверждения; все три проверены и не подтвердились. Они приводятся здесь, чтобы отделить установленное от правдоподобного.</w:t>
+        <w:t xml:space="preserve">Найденный закон соединяет три статьи серии в одно рассуждение. Устройство иерархии атмосферной циркуляции на размерах от 50 до 1600 км везде одно: каждый крупный уровень передает всем уровням ниже себя один и тот же рисунок размещения, и согласованность двух уровней задана их общим крупным уровнем. Территории различаются не устройством, а силой наследования – тем, насколько велика унаследованная часть рисунка по сравнению с общей изменчивостью. Сопряженность соседних уровней</w:t>
+      </w:r>
+      <w:r>
+        <w:rPr>
+          <w:rFonts w:ascii="Times New Roman" w:hAnsi="Times New Roman"/>
+          <w:sz w:val="24"/>
+        </w:rPr>
+        <w:t xml:space="preserve"> </w:t>
+      </w:r>
+      <m:oMath>
+        <m:r>
+          <m:t>P</m:t>
+        </m:r>
+      </m:oMath>
+      <w:r>
+        <w:rPr>
+          <w:rFonts w:ascii="Times New Roman" w:hAnsi="Times New Roman"/>
+          <w:sz w:val="24"/>
+        </w:rPr>
+        <w:t xml:space="preserve"> </w:t>
+      </w:r>
+      <w:r>
+        <w:rPr>
+          <w:rFonts w:ascii="Times New Roman" w:hAnsi="Times New Roman"/>
+          <w:sz w:val="24"/>
+        </w:rPr>
+        <w:t xml:space="preserve">– нормированная мера этой силы; ее карта (статья II) – карта силы наследования. Пути внетропических циклонов – территории, где наследование сильно; очаги глубокой конвекции – где оно слабо; конвекция и активность циклонов, найденные в статье II как факторы карты, суть факторы амплитуды закона, а не его формы. Перемежаемость огибающих, входившая в статье II в число факторов, оказывается проявлением того же наследования.</w:t>
       </w:r>
     </w:p>
     <w:p>
@@ -2252,268 +2292,35 @@
       <w:r>
         <w:rPr>
           <w:rFonts w:ascii="Times New Roman" w:hAnsi="Times New Roman"/>
-          <w:i/>
-          <w:iCs/>
-          <w:sz w:val="24"/>
-        </w:rPr>
-        <w:t xml:space="preserve">Глубина наследования.</w:t>
-      </w:r>
-      <w:r>
-        <w:rPr>
-          <w:rFonts w:ascii="Times New Roman" w:hAnsi="Times New Roman"/>
-          <w:sz w:val="24"/>
-        </w:rPr>
-        <w:t xml:space="preserve"> </w:t>
-      </w:r>
-      <w:r>
-        <w:rPr>
-          <w:rFonts w:ascii="Times New Roman" w:hAnsi="Times New Roman"/>
-          <w:sz w:val="24"/>
-        </w:rPr>
-        <w:t xml:space="preserve">Если</w:t>
-      </w:r>
-      <w:r>
-        <w:rPr>
-          <w:rFonts w:ascii="Times New Roman" w:hAnsi="Times New Roman"/>
-          <w:sz w:val="24"/>
-        </w:rPr>
-        <w:t xml:space="preserve"> </w:t>
-      </w:r>
-      <m:oMath>
-        <m:r>
-          <m:t>G</m:t>
-        </m:r>
-        <m:r>
-          <m:rPr>
-            <m:sty m:val="p"/>
-          </m:rPr>
-          <m:t>(</m:t>
-        </m:r>
-        <m:r>
-          <m:t>a</m:t>
-        </m:r>
-        <m:r>
-          <m:rPr>
-            <m:sty m:val="p"/>
-          </m:rPr>
-          <m:t>)</m:t>
-        </m:r>
-      </m:oMath>
-      <w:r>
-        <w:rPr>
-          <w:rFonts w:ascii="Times New Roman" w:hAnsi="Times New Roman"/>
-          <w:sz w:val="24"/>
-        </w:rPr>
-        <w:t xml:space="preserve"> </w:t>
-      </w:r>
-      <w:r>
-        <w:rPr>
-          <w:rFonts w:ascii="Times New Roman" w:hAnsi="Times New Roman"/>
-          <w:sz w:val="24"/>
-        </w:rPr>
-        <w:t xml:space="preserve">убывает, естественно спросить, на каком размере</w:t>
-      </w:r>
-      <w:r>
-        <w:rPr>
-          <w:rFonts w:ascii="Times New Roman" w:hAnsi="Times New Roman"/>
-          <w:sz w:val="24"/>
-        </w:rPr>
-        <w:t xml:space="preserve"> </w:t>
-      </w:r>
-      <m:oMath>
-        <m:r>
-          <m:t>L</m:t>
-        </m:r>
-      </m:oMath>
-      <w:r>
-        <w:rPr>
-          <w:rFonts w:ascii="Times New Roman" w:hAnsi="Times New Roman"/>
-          <w:sz w:val="24"/>
-        </w:rPr>
-        <w:t xml:space="preserve"> </w:t>
-      </w:r>
-      <w:r>
-        <w:rPr>
-          <w:rFonts w:ascii="Times New Roman" w:hAnsi="Times New Roman"/>
-          <w:sz w:val="24"/>
-        </w:rPr>
-        <w:t xml:space="preserve">наследование прекращается. Оценка</w:t>
-      </w:r>
-      <w:r>
-        <w:rPr>
-          <w:rFonts w:ascii="Times New Roman" w:hAnsi="Times New Roman"/>
-          <w:sz w:val="24"/>
-        </w:rPr>
-        <w:t xml:space="preserve"> </w:t>
-      </w:r>
-      <m:oMath>
-        <m:r>
-          <m:t>L</m:t>
-        </m:r>
-      </m:oMath>
-      <w:r>
-        <w:rPr>
-          <w:rFonts w:ascii="Times New Roman" w:hAnsi="Times New Roman"/>
-          <w:sz w:val="24"/>
-        </w:rPr>
-        <w:t xml:space="preserve"> </w:t>
-      </w:r>
-      <w:r>
-        <w:rPr>
-          <w:rFonts w:ascii="Times New Roman" w:hAnsi="Times New Roman"/>
-          <w:sz w:val="24"/>
-        </w:rPr>
-        <w:t xml:space="preserve">по логарифмической зависимости дала 1200–1960 км по областям и не зависела от размера области. Однако она зависела от того, до какого уровня доступна лестница: 830 км при лестнице до 400 км, 1090 км – до 800 км, 1560 км – до 1600 км; на планетарной сетке с лестницей до 400 км – 540 км. Зависимость</w:t>
-      </w:r>
-      <w:r>
-        <w:rPr>
-          <w:rFonts w:ascii="Times New Roman" w:hAnsi="Times New Roman"/>
-          <w:sz w:val="24"/>
-        </w:rPr>
-        <w:t xml:space="preserve"> </w:t>
-      </w:r>
-      <m:oMath>
-        <m:r>
-          <m:t>G</m:t>
-        </m:r>
-        <m:r>
-          <m:rPr>
-            <m:sty m:val="p"/>
-          </m:rPr>
-          <m:t>(</m:t>
-        </m:r>
-        <m:r>
-          <m:t>a</m:t>
-        </m:r>
-        <m:r>
-          <m:rPr>
-            <m:sty m:val="p"/>
-          </m:rPr>
-          <m:t>)</m:t>
-        </m:r>
-      </m:oMath>
-      <w:r>
-        <w:rPr>
-          <w:rFonts w:ascii="Times New Roman" w:hAnsi="Times New Roman"/>
-          <w:sz w:val="24"/>
-        </w:rPr>
-        <w:t xml:space="preserve"> </w:t>
-      </w:r>
-      <w:r>
-        <w:rPr>
-          <w:rFonts w:ascii="Times New Roman" w:hAnsi="Times New Roman"/>
-          <w:sz w:val="24"/>
-        </w:rPr>
-        <w:t xml:space="preserve">ближе к степенной, чем к логарифмической, а у степенной функции конечного предела нет. Глубина наследования по этим данным не определяется и как характеристика территории не сообщается.</w:t>
-      </w:r>
-    </w:p>
-    <w:p>
-      <w:pPr>
-        <w:pStyle w:val="BodyText"/>
-      </w:pPr>
-      <w:r>
-        <w:rPr>
-          <w:rFonts w:ascii="Times New Roman" w:hAnsi="Times New Roman"/>
-          <w:i/>
-          <w:iCs/>
-          <w:sz w:val="24"/>
-        </w:rPr>
-        <w:t xml:space="preserve">Механизм.</w:t>
-      </w:r>
-      <w:r>
-        <w:rPr>
-          <w:rFonts w:ascii="Times New Roman" w:hAnsi="Times New Roman"/>
-          <w:sz w:val="24"/>
-        </w:rPr>
-        <w:t xml:space="preserve"> </w:t>
-      </w:r>
-      <w:r>
-        <w:rPr>
-          <w:rFonts w:ascii="Times New Roman" w:hAnsi="Times New Roman"/>
-          <w:sz w:val="24"/>
-        </w:rPr>
-        <w:t xml:space="preserve">Исходное предположение работы состояло в том, что мелкие вихри рождаются двумя путями – растяжением и сжатием воздуха внутри циклонов (и тогда повторяют их рисунок) и глубокой конвекцией (и тогда размещаются по прогреву поверхности, независимо от циклонов), а сопряженность измеряет долю первого пути (Craig, Cohen, 2006; Hoskins, Bretherton, 1972). Из этого предположения следуют два проверяемых утверждения: конвективная неустойчивость должна сильнее всего понижать сопряженность на самых мелких уровнях, а мелкая изменчивость должна размещаться там, где крупный поток растягивает воздух. Первое не подтвердилось: коэффициенты связи с конвективной неустойчивостью по трем парам соседних уровней неотличимы от нуля. Второе подтвердилось лишь частично: мелкая изменчивость действительно размещается там, где крупный поток растягивает воздух, а не там, где он вращает (частная корреляция</w:t>
-      </w:r>
-      <w:r>
-        <w:rPr>
-          <w:rFonts w:ascii="Times New Roman" w:hAnsi="Times New Roman"/>
-          <w:sz w:val="24"/>
-        </w:rPr>
-        <w:t xml:space="preserve"> </w:t>
-      </w:r>
-      <m:oMath>
-        <m:r>
-          <m:rPr>
-            <m:sty m:val="p"/>
-          </m:rPr>
-          <m:t>+</m:t>
-        </m:r>
-        <m:r>
-          <m:t>0.07</m:t>
-        </m:r>
-      </m:oMath>
-      <w:r>
-        <w:rPr>
-          <w:rFonts w:ascii="Times New Roman" w:hAnsi="Times New Roman"/>
-          <w:sz w:val="24"/>
-        </w:rPr>
-        <w:t xml:space="preserve">, одинаковая на обоих носителях, с чистой проверкой на сдвиг по времени), но карта этого показателя связана с картой сопряженности слабо (0.14 при пороге 0.20). Растяжение воздуха крупным потоком есть везде и одинаково; географию сопряженности оно не несет. Механизм различий между территориями остается неустановленным, и направленные выражения (конвекция</w:t>
-      </w:r>
-      <w:r>
-        <w:rPr>
-          <w:rFonts w:ascii="Times New Roman" w:hAnsi="Times New Roman"/>
-          <w:sz w:val="24"/>
-        </w:rPr>
-        <w:t xml:space="preserve"> </w:t>
-      </w:r>
-      <w:r>
-        <w:rPr>
-          <w:rFonts w:ascii="Times New Roman" w:hAnsi="Times New Roman"/>
-          <w:sz w:val="24"/>
-        </w:rPr>
-        <w:t xml:space="preserve">“разрушает”</w:t>
-      </w:r>
-      <w:r>
-        <w:rPr>
-          <w:rFonts w:ascii="Times New Roman" w:hAnsi="Times New Roman"/>
-          <w:sz w:val="24"/>
-        </w:rPr>
-        <w:t xml:space="preserve"> </w:t>
-      </w:r>
-      <w:r>
-        <w:rPr>
-          <w:rFonts w:ascii="Times New Roman" w:hAnsi="Times New Roman"/>
-          <w:sz w:val="24"/>
-        </w:rPr>
-        <w:t xml:space="preserve">наследование) в статье не используются.</w:t>
-      </w:r>
-    </w:p>
-    <w:p>
-      <w:pPr>
-        <w:pStyle w:val="BodyText"/>
-      </w:pPr>
-      <w:r>
-        <w:rPr>
-          <w:rFonts w:ascii="Times New Roman" w:hAnsi="Times New Roman"/>
-          <w:i/>
-          <w:iCs/>
-          <w:sz w:val="24"/>
-        </w:rPr>
-        <w:t xml:space="preserve">Баланс унаследованной и собственной изменчивости.</w:t>
-      </w:r>
-      <w:r>
-        <w:rPr>
-          <w:rFonts w:ascii="Times New Roman" w:hAnsi="Times New Roman"/>
-          <w:sz w:val="24"/>
-        </w:rPr>
-        <w:t xml:space="preserve"> </w:t>
-      </w:r>
-      <w:r>
-        <w:rPr>
-          <w:rFonts w:ascii="Times New Roman" w:hAnsi="Times New Roman"/>
-          <w:sz w:val="24"/>
-        </w:rPr>
-        <w:t xml:space="preserve">Закон (</w:t>
+          <w:sz w:val="24"/>
+        </w:rPr>
+        <w:t xml:space="preserve">Закон описывает устройство иерархии, но не отвечает на вопрос, почему сила наследования распределена по планете именно так. Известно лишь, с чем она связана статистически: с активностью внетропических циклонов и с глубокой конвекцией (статья II). Проверка двух правдоподобных объяснений – растяжения воздуха внутри циклонов, которое должно было бы привязывать мелкие вихри к крупным (Hoskins, Bretherton, 1972), и глубокой конвекции, которая должна была бы размещать их независимо от крупных (Craig, Cohen, 2006), – показала, что растяжение воздуха есть везде и одинаково, а различий между территориями не несет. Механизм распределения амплитуды по карте остается предметом будущих исследований. Установленное здесь – что закон выполняется без исключений на всех носителях, включая модельный расчет без усвоения наблюдений, и не зависит от режима циркуляции, – позволяет говорить об устройстве иерархии как о свойстве атмосферы, а не наблюдательной системы или способа измерения.</w:t>
+      </w:r>
+    </w:p>
+    <w:bookmarkEnd w:id="17"/>
+    <w:bookmarkStart w:id="18" w:name="Xd021559b26ad9caccfa208cf343e79e4d38f9a9"/>
+    <w:p>
+      <w:pPr>
+        <w:pStyle w:val="Heading2"/>
+      </w:pPr>
+      <w:r>
+        <w:rPr>
+          <w:rFonts w:ascii="Times New Roman" w:hAnsi="Times New Roman"/>
+          <w:sz w:val="24"/>
+        </w:rPr>
+        <w:t xml:space="preserve">Место результата в науке о масштабной организации</w:t>
+      </w:r>
+    </w:p>
+    <w:p>
+      <w:pPr>
+        <w:pStyle w:val="FirstParagraph"/>
+      </w:pPr>
+      <w:r>
+        <w:rPr>
+          <w:rFonts w:ascii="Times New Roman" w:hAnsi="Times New Roman"/>
+          <w:sz w:val="24"/>
+        </w:rPr>
+        <w:t xml:space="preserve">Форма измеряемой величины не нова. Корреляция логарифмов огибающих разных масштабов в пространстве и по размерам введена для рядов турбулентности (Arneodo et al., 1998) и применена к спутниковым изображениям облачности (Roux et al., 2000), к приземному слою атмосферы с той же суррогатной поправкой (Basu et al., 2007), к статистикам изображений и к полям крупномасштабной структуры Вселенной (Allys et al., 2020; Cheng et al., 2024); ее ближайший родственник в океанологии – статистики рассеяния, которыми недавно различены два района Северной Атлантики с одинаковым спектром (Skinner et al., 2025). В метеорологии карты локальных спектров показали, что мезомасштабная изменчивость организована внутри огибающих крупного масштаба, с исключениями над очагами конвекции и горами (Kouhen et al., 2024; Wang, Sardeshmukh, 2021). Новое в настоящей работе – не статистика, а объект: закон (</w:t>
       </w:r>
       <w:hyperlink w:anchor="eq:law">
         <w:r>
@@ -2528,79 +2335,11 @@
           <w:rFonts w:ascii="Times New Roman" w:hAnsi="Times New Roman"/>
           <w:sz w:val="24"/>
         </w:rPr>
-        <w:t xml:space="preserve">) подсказывает, что полную изменчивость уровня можно разделить на унаследованную</w:t>
-      </w:r>
-      <w:r>
-        <w:rPr>
-          <w:rFonts w:ascii="Times New Roman" w:hAnsi="Times New Roman"/>
-          <w:sz w:val="24"/>
-        </w:rPr>
-        <w:t xml:space="preserve"> </w:t>
-      </w:r>
-      <m:oMath>
-        <m:r>
-          <m:t>G</m:t>
-        </m:r>
-      </m:oMath>
-      <w:r>
-        <w:rPr>
-          <w:rFonts w:ascii="Times New Roman" w:hAnsi="Times New Roman"/>
-          <w:sz w:val="24"/>
-        </w:rPr>
-        <w:t xml:space="preserve"> </w:t>
-      </w:r>
-      <w:r>
-        <w:rPr>
-          <w:rFonts w:ascii="Times New Roman" w:hAnsi="Times New Roman"/>
-          <w:sz w:val="24"/>
-        </w:rPr>
-        <w:t xml:space="preserve">и собственную, и построить карту собственной. Проверка показала, что сверхспектральный избыток изменчивости уровня (0.06 при 200 км) меньше унаследованной ковариации (0.09) в 98 % ячеек. Такое разделение изменчивости невозможно: закон верно описывает ковариации, которые целиком являются общими, но не разделяет изменчивость на слагаемые.</w:t>
-      </w:r>
-      <w:r>
-        <w:rPr>
-          <w:rFonts w:ascii="Times New Roman" w:hAnsi="Times New Roman"/>
-          <w:sz w:val="24"/>
-        </w:rPr>
-        <w:t xml:space="preserve"> </w:t>
-      </w:r>
-      <w:r>
-        <w:rPr>
-          <w:rFonts w:ascii="Times New Roman" w:hAnsi="Times New Roman"/>
-          <w:sz w:val="24"/>
-        </w:rPr>
-        <w:t xml:space="preserve">“Сила наследования”</w:t>
-      </w:r>
-      <w:r>
-        <w:rPr>
-          <w:rFonts w:ascii="Times New Roman" w:hAnsi="Times New Roman"/>
-          <w:sz w:val="24"/>
-        </w:rPr>
-        <w:t xml:space="preserve"> </w:t>
-      </w:r>
-      <w:r>
-        <w:rPr>
-          <w:rFonts w:ascii="Times New Roman" w:hAnsi="Times New Roman"/>
-          <w:sz w:val="24"/>
-        </w:rPr>
-        <w:t xml:space="preserve">в этой работе – нормированная амплитуда, а не доля изменчивости.</w:t>
-      </w:r>
-    </w:p>
-    <w:bookmarkEnd w:id="16"/>
-    <w:bookmarkEnd w:id="17"/>
-    <w:bookmarkStart w:id="22" w:name="обсуждение-результатов"/>
-    <w:p>
-      <w:pPr>
-        <w:pStyle w:val="Heading1"/>
-      </w:pPr>
-      <w:r>
-        <w:rPr>
-          <w:rFonts w:ascii="Times New Roman" w:hAnsi="Times New Roman"/>
-          <w:sz w:val="24"/>
-        </w:rPr>
-        <w:t xml:space="preserve">ОБСУЖДЕНИЕ РЕЗУЛЬТАТОВ</w:t>
-      </w:r>
-    </w:p>
-    <w:bookmarkStart w:id="18" w:name="единое-объяснение-карты"/>
+        <w:t xml:space="preserve">) установлен для динамического поля атмосферы на планете в целом, показано, что его форма не зависит от территории, и что известная ранее сопряженность соседних уровней есть его нормированная амплитуда. Тем самым сопряженность получает место в теории иерархических систем: это первая измеренная для атмосферы характеристика связи между уровнями – того, что в ландшафтоведении называют межуровневыми связями (Хорошев, 2016) и оценивают как долю свойств участка, заданную геосистемами высшего ранга (Хорошев и др., 2010), а в общей теории иерархий – как степень почти-разложимости (Simon, 1962). Оговорка обязательна: закон и его амплитуда – статистические характеристики одновременного размещения уровней; они не описывают ни направления передачи, ни переноса энергии между уровнями (статья I).</w:t>
+      </w:r>
+    </w:p>
+    <w:bookmarkEnd w:id="18"/>
+    <w:bookmarkStart w:id="19" w:name="значение-для-районирования"/>
     <w:p>
       <w:pPr>
         <w:pStyle w:val="Heading2"/>
@@ -2610,7 +2349,7 @@
           <w:rFonts w:ascii="Times New Roman" w:hAnsi="Times New Roman"/>
           <w:sz w:val="24"/>
         </w:rPr>
-        <w:t xml:space="preserve">Единое объяснение карты</w:t>
+        <w:t xml:space="preserve">Значение для районирования</w:t>
       </w:r>
     </w:p>
     <w:p>
@@ -2622,116 +2361,11 @@
           <w:rFonts w:ascii="Times New Roman" w:hAnsi="Times New Roman"/>
           <w:sz w:val="24"/>
         </w:rPr>
-        <w:t xml:space="preserve">Найденный закон соединяет три статьи серии в одно рассуждение. Устройство иерархии атмосферной циркуляции на размерах от 50 до 1600 км везде одно: каждый крупный уровень передает всем уровням ниже себя один и тот же рисунок размещения, и согласованность двух уровней задана их общим крупным уровнем. Территории различаются не устройством, а силой наследования – тем, насколько велика унаследованная часть рисунка по сравнению с общей изменчивостью. Сопряженность соседних уровней</w:t>
-      </w:r>
-      <w:r>
-        <w:rPr>
-          <w:rFonts w:ascii="Times New Roman" w:hAnsi="Times New Roman"/>
-          <w:sz w:val="24"/>
-        </w:rPr>
-        <w:t xml:space="preserve"> </w:t>
-      </w:r>
-      <m:oMath>
-        <m:r>
-          <m:t>P</m:t>
-        </m:r>
-      </m:oMath>
-      <w:r>
-        <w:rPr>
-          <w:rFonts w:ascii="Times New Roman" w:hAnsi="Times New Roman"/>
-          <w:sz w:val="24"/>
-        </w:rPr>
-        <w:t xml:space="preserve"> </w:t>
-      </w:r>
-      <w:r>
-        <w:rPr>
-          <w:rFonts w:ascii="Times New Roman" w:hAnsi="Times New Roman"/>
-          <w:sz w:val="24"/>
-        </w:rPr>
-        <w:t xml:space="preserve">– нормированная мера этой силы; ее карта (статья II) – карта силы наследования. Пути внетропических циклонов – территории, где наследование сильно; очаги глубокой конвекции – где оно слабо; конвекция и активность циклонов, найденные в статье II как факторы карты, суть факторы амплитуды закона, а не его формы. Перемежаемость огибающих, входившая в статье II в число факторов, оказывается проявлением того же наследования.</w:t>
-      </w:r>
-    </w:p>
-    <w:p>
-      <w:pPr>
-        <w:pStyle w:val="BodyText"/>
-      </w:pPr>
-      <w:r>
-        <w:rPr>
-          <w:rFonts w:ascii="Times New Roman" w:hAnsi="Times New Roman"/>
-          <w:sz w:val="24"/>
-        </w:rPr>
-        <w:t xml:space="preserve">Такое объяснение одновременно скромнее и сильнее исходного замысла. Скромнее – потому что механизм различий между территориями не установлен, глубина наследования не измеряется и баланс изменчивости не строится. Сильнее – потому что закон выполняется без исключений на всех носителях, включая модельный расчет без усвоения наблюдений, и не зависит от режима циркуляции. Это позволяет говорить об устройстве иерархии как о свойстве атмосферы, а не о свойстве наблюдательной системы или способа измерения.</w:t>
-      </w:r>
-    </w:p>
-    <w:bookmarkEnd w:id="18"/>
-    <w:bookmarkStart w:id="19" w:name="Xd021559b26ad9caccfa208cf343e79e4d38f9a9"/>
-    <w:p>
-      <w:pPr>
-        <w:pStyle w:val="Heading2"/>
-      </w:pPr>
-      <w:r>
-        <w:rPr>
-          <w:rFonts w:ascii="Times New Roman" w:hAnsi="Times New Roman"/>
-          <w:sz w:val="24"/>
-        </w:rPr>
-        <w:t xml:space="preserve">Место результата в науке о масштабной организации</w:t>
-      </w:r>
-    </w:p>
-    <w:p>
-      <w:pPr>
-        <w:pStyle w:val="FirstParagraph"/>
-      </w:pPr>
-      <w:r>
-        <w:rPr>
-          <w:rFonts w:ascii="Times New Roman" w:hAnsi="Times New Roman"/>
-          <w:sz w:val="24"/>
-        </w:rPr>
-        <w:t xml:space="preserve">Форма измеряемой величины не нова. Корреляция логарифмов огибающих разных масштабов в пространстве и по размерам введена для рядов турбулентности (Arneodo et al., 1998) и применена к спутниковым изображениям облачности (Roux et al., 2000), к приземному слою атмосферы с той же суррогатной поправкой (Basu et al., 2007), к статистикам изображений и к полям крупномасштабной структуры Вселенной (Allys et al., 2020; Cheng et al., 2024); ее ближайший родственник в океанологии – статистики рассеяния, которыми недавно различены два района Северной Атлантики с одинаковым спектром (Skinner et al., 2025). В метеорологии карты локальных спектров показали, что мезомасштабная изменчивость организована внутри огибающих крупного масштаба, с исключениями над очагами конвекции и горами (Kouhen et al., 2024; Wang, Sardeshmukh, 2021). Новое в настоящей работе – не статистика, а объект: закон (</w:t>
-      </w:r>
-      <w:hyperlink w:anchor="eq:law">
-        <w:r>
-          <w:rPr>
-            <w:rStyle w:val="Hyperlink"/>
-          </w:rPr>
-          <w:t xml:space="preserve">[eq:law]</w:t>
-        </w:r>
-      </w:hyperlink>
-      <w:r>
-        <w:rPr>
-          <w:rFonts w:ascii="Times New Roman" w:hAnsi="Times New Roman"/>
-          <w:sz w:val="24"/>
-        </w:rPr>
-        <w:t xml:space="preserve">) установлен для динамического поля атмосферы на планете в целом, показано, что его форма не зависит от территории, и что известная ранее сопряженность соседних уровней есть его нормированная амплитуда. Тем самым сопряженность получает место в теории иерархических систем: это первая измеренная для атмосферы характеристика связи между уровнями – того, что в ландшафтоведении называют межуровневыми связями (Хорошев, 2016) и оценивают как долю свойств участка, заданную геосистемами высшего ранга (Хорошев и др., 2010), а в общей теории иерархий – как степень почти-разложимости (Simon, 1962). Оговорка обязательна: закон и его амплитуда – статистические характеристики одновременного размещения уровней; они не описывают ни направления передачи, ни переноса энергии между уровнями (статья I).</w:t>
+        <w:t xml:space="preserve">Для районирования закон дает три вещи. Во-первых, основание: карта сопряженности делит территории по характеристике устройства циркуляции, а не по среднему состоянию, как схемы климатического районирования (Исаченко, 1991), и это устройство подчиняется простому закону. Во-вторых, экономию: поскольку форма закона везде одна, территория описывается одним числом – силой наследования; несколько статистик перемежаемости, которые пришлось бы вводить иначе, заменяются одной. В-третьих, единицу сравнения: две территории с одинаковой силой наследования устроены одинаково на всех уровнях от 50 до 1600 км, что дает основание выбирать территории-аналоги для региональных исследований мезомасштабных процессов. Схема районирования статьи II при этом не меняется: закон не переопределяет карту, а объясняет ее.</w:t>
       </w:r>
     </w:p>
     <w:bookmarkEnd w:id="19"/>
-    <w:bookmarkStart w:id="20" w:name="значение-для-районирования"/>
-    <w:p>
-      <w:pPr>
-        <w:pStyle w:val="Heading2"/>
-      </w:pPr>
-      <w:r>
-        <w:rPr>
-          <w:rFonts w:ascii="Times New Roman" w:hAnsi="Times New Roman"/>
-          <w:sz w:val="24"/>
-        </w:rPr>
-        <w:t xml:space="preserve">Значение для районирования</w:t>
-      </w:r>
-    </w:p>
-    <w:p>
-      <w:pPr>
-        <w:pStyle w:val="FirstParagraph"/>
-      </w:pPr>
-      <w:r>
-        <w:rPr>
-          <w:rFonts w:ascii="Times New Roman" w:hAnsi="Times New Roman"/>
-          <w:sz w:val="24"/>
-        </w:rPr>
-        <w:t xml:space="preserve">Для районирования закон дает три вещи. Во-первых, основание: карта сопряженности делит территории по характеристике устройства циркуляции, а не по среднему состоянию, как схемы климатического районирования (Исаченко, 1991), и это устройство подчиняется простому закону. Во-вторых, экономию: поскольку форма закона везде одна, территория описывается одним числом – силой наследования; несколько статистик перемежаемости, которые пришлось бы вводить иначе, заменяются одной. В-третьих, единицу сравнения: две территории с одинаковой силой наследования устроены одинаково на всех уровнях от 50 до 1600 км, что дает основание выбирать территории-аналоги для региональных исследований мезомасштабных процессов. Схема районирования статьи II при этом не меняется: закон не переопределяет карту, а объясняет ее.</w:t>
-      </w:r>
-    </w:p>
-    <w:bookmarkEnd w:id="20"/>
-    <w:bookmarkStart w:id="21" w:name="ограничения"/>
+    <w:bookmarkStart w:id="20" w:name="ограничения"/>
     <w:p>
       <w:pPr>
         <w:pStyle w:val="Heading2"/>
@@ -2822,109 +2456,97 @@
         <w:t xml:space="preserve">) неустойчив по окнам и как характеристика территории не сообщается. Наконец, проверки статьи опираются на те же поля, из которых вычислена сопряженность; независимая проверка по другим переменным – например, по полям осадков – остается задачей будущего.</w:t>
       </w:r>
     </w:p>
+    <w:bookmarkEnd w:id="20"/>
     <w:bookmarkEnd w:id="21"/>
+    <w:bookmarkStart w:id="22" w:name="заключение"/>
+    <w:p>
+      <w:pPr>
+        <w:pStyle w:val="Heading1"/>
+      </w:pPr>
+      <w:r>
+        <w:rPr>
+          <w:rFonts w:ascii="Times New Roman" w:hAnsi="Times New Roman"/>
+          <w:sz w:val="24"/>
+        </w:rPr>
+        <w:t xml:space="preserve">ЗАКЛЮЧЕНИЕ</w:t>
+      </w:r>
+    </w:p>
+    <w:p>
+      <w:pPr>
+        <w:pStyle w:val="FirstParagraph"/>
+      </w:pPr>
+      <w:r>
+        <w:rPr>
+          <w:rFonts w:ascii="Times New Roman" w:hAnsi="Times New Roman"/>
+          <w:sz w:val="24"/>
+        </w:rPr>
+        <w:t xml:space="preserve">1. Согласованность размещения масштабных уровней атмосферной циркуляции не ограничена соседними уровнями: мелкие вихри повторяют рисунок всех уровней выше себя, вплоть до масштаба циклонов; для несоседних уровней связь видна в исходных данных без суррогатной поправки.</w:t>
+      </w:r>
+    </w:p>
+    <w:p>
+      <w:pPr>
+        <w:pStyle w:val="BodyText"/>
+      </w:pPr>
+      <w:r>
+        <w:rPr>
+          <w:rFonts w:ascii="Times New Roman" w:hAnsi="Times New Roman"/>
+          <w:sz w:val="24"/>
+        </w:rPr>
+        <w:t xml:space="preserve">2. Установлен закон: сверхспектральная согласованность двух уровней зависит только от более крупного из них и не зависит от расстояния между уровнями. Каждый крупный уровень передает всем уровням ниже один и тот же рисунок размещения. Закон объясняет 99.6 % изменчивости согласованностей на двенадцати областях, выполняется в 100 % из 902 ячеек планетарной сетки, не зависит от размера области и режима циркуляции и воспроизводится в модельном расчете без усвоения наблюдений.</w:t>
+      </w:r>
+    </w:p>
+    <w:p>
+      <w:pPr>
+        <w:pStyle w:val="BodyText"/>
+      </w:pPr>
+      <w:r>
+        <w:rPr>
+          <w:rFonts w:ascii="Times New Roman" w:hAnsi="Times New Roman"/>
+          <w:sz w:val="24"/>
+        </w:rPr>
+        <w:t xml:space="preserve">3. Сопряженность соседних уровней</w:t>
+      </w:r>
+      <w:r>
+        <w:rPr>
+          <w:rFonts w:ascii="Times New Roman" w:hAnsi="Times New Roman"/>
+          <w:sz w:val="24"/>
+        </w:rPr>
+        <w:t xml:space="preserve"> </w:t>
+      </w:r>
+      <m:oMath>
+        <m:r>
+          <m:t>P</m:t>
+        </m:r>
+      </m:oMath>
+      <w:r>
+        <w:rPr>
+          <w:rFonts w:ascii="Times New Roman" w:hAnsi="Times New Roman"/>
+          <w:sz w:val="24"/>
+        </w:rPr>
+        <w:t xml:space="preserve"> </w:t>
+      </w:r>
+      <w:r>
+        <w:rPr>
+          <w:rFonts w:ascii="Times New Roman" w:hAnsi="Times New Roman"/>
+          <w:sz w:val="24"/>
+        </w:rPr>
+        <w:t xml:space="preserve">первых двух статей есть нормированная сила наследования – амплитуда закона, отнесенная к общей изменчивости уровней. Ее карта – карта силы наследования. Территории различаются силой наследования, а не устройством иерархии, которое везде одно.</w:t>
+      </w:r>
+    </w:p>
+    <w:p>
+      <w:pPr>
+        <w:pStyle w:val="BodyText"/>
+      </w:pPr>
+      <w:r>
+        <w:rPr>
+          <w:rFonts w:ascii="Times New Roman" w:hAnsi="Times New Roman"/>
+          <w:sz w:val="24"/>
+        </w:rPr>
+        <w:t xml:space="preserve">4. Для районирования закон дает основание, экономию описания и единицу сравнения территорий; схема районирования второй статьи не меняется, а получает объяснение.</w:t>
+      </w:r>
+    </w:p>
     <w:bookmarkEnd w:id="22"/>
-    <w:bookmarkStart w:id="23" w:name="заключение"/>
-    <w:p>
-      <w:pPr>
-        <w:pStyle w:val="Heading1"/>
-      </w:pPr>
-      <w:r>
-        <w:rPr>
-          <w:rFonts w:ascii="Times New Roman" w:hAnsi="Times New Roman"/>
-          <w:sz w:val="24"/>
-        </w:rPr>
-        <w:t xml:space="preserve">ЗАКЛЮЧЕНИЕ</w:t>
-      </w:r>
-    </w:p>
-    <w:p>
-      <w:pPr>
-        <w:pStyle w:val="FirstParagraph"/>
-      </w:pPr>
-      <w:r>
-        <w:rPr>
-          <w:rFonts w:ascii="Times New Roman" w:hAnsi="Times New Roman"/>
-          <w:sz w:val="24"/>
-        </w:rPr>
-        <w:t xml:space="preserve">1. Согласованность размещения масштабных уровней атмосферной циркуляции не ограничена соседними уровнями: мелкие вихри повторяют рисунок всех уровней выше себя, вплоть до масштаба циклонов; для несоседних уровней связь видна в исходных данных без суррогатной поправки.</w:t>
-      </w:r>
-    </w:p>
-    <w:p>
-      <w:pPr>
-        <w:pStyle w:val="BodyText"/>
-      </w:pPr>
-      <w:r>
-        <w:rPr>
-          <w:rFonts w:ascii="Times New Roman" w:hAnsi="Times New Roman"/>
-          <w:sz w:val="24"/>
-        </w:rPr>
-        <w:t xml:space="preserve">2. Установлен закон: сверхспектральная согласованность двух уровней зависит только от более крупного из них и не зависит от расстояния между уровнями. Каждый крупный уровень передает всем уровням ниже один и тот же рисунок размещения. Закон объясняет 99.6 % изменчивости согласованностей на двенадцати областях, выполняется в 100 % из 902 ячеек планетарной сетки, не зависит от размера области и режима циркуляции и воспроизводится в модельном расчете без усвоения наблюдений.</w:t>
-      </w:r>
-    </w:p>
-    <w:p>
-      <w:pPr>
-        <w:pStyle w:val="BodyText"/>
-      </w:pPr>
-      <w:r>
-        <w:rPr>
-          <w:rFonts w:ascii="Times New Roman" w:hAnsi="Times New Roman"/>
-          <w:sz w:val="24"/>
-        </w:rPr>
-        <w:t xml:space="preserve">3. Сопряженность соседних уровней</w:t>
-      </w:r>
-      <w:r>
-        <w:rPr>
-          <w:rFonts w:ascii="Times New Roman" w:hAnsi="Times New Roman"/>
-          <w:sz w:val="24"/>
-        </w:rPr>
-        <w:t xml:space="preserve"> </w:t>
-      </w:r>
-      <m:oMath>
-        <m:r>
-          <m:t>P</m:t>
-        </m:r>
-      </m:oMath>
-      <w:r>
-        <w:rPr>
-          <w:rFonts w:ascii="Times New Roman" w:hAnsi="Times New Roman"/>
-          <w:sz w:val="24"/>
-        </w:rPr>
-        <w:t xml:space="preserve"> </w:t>
-      </w:r>
-      <w:r>
-        <w:rPr>
-          <w:rFonts w:ascii="Times New Roman" w:hAnsi="Times New Roman"/>
-          <w:sz w:val="24"/>
-        </w:rPr>
-        <w:t xml:space="preserve">первых двух статей есть нормированная сила наследования – амплитуда закона, отнесенная к общей изменчивости уровней. Ее карта – карта силы наследования. Территории различаются силой наследования, а не устройством иерархии, которое везде одно.</w:t>
-      </w:r>
-    </w:p>
-    <w:p>
-      <w:pPr>
-        <w:pStyle w:val="BodyText"/>
-      </w:pPr>
-      <w:r>
-        <w:rPr>
-          <w:rFonts w:ascii="Times New Roman" w:hAnsi="Times New Roman"/>
-          <w:sz w:val="24"/>
-        </w:rPr>
-        <w:t xml:space="preserve">4. Три более сильных утверждения данными не подтверждены: глубина наследования по этим данным не определяется; механизм различий между территориями не установлен; изменчивость уровня не разделяется на унаследованную и собственную.</w:t>
-      </w:r>
-    </w:p>
-    <w:p>
-      <w:pPr>
-        <w:pStyle w:val="BodyText"/>
-      </w:pPr>
-      <w:r>
-        <w:rPr>
-          <w:rFonts w:ascii="Times New Roman" w:hAnsi="Times New Roman"/>
-          <w:sz w:val="24"/>
-        </w:rPr>
-        <w:t xml:space="preserve">5. Для районирования закон дает основание, экономию описания и единицу сравнения территорий; схема районирования второй статьи не меняется, а получает объяснение.</w:t>
-      </w:r>
-    </w:p>
-    <w:bookmarkEnd w:id="23"/>
-    <w:bookmarkStart w:id="39" w:name="финансирование"/>
+    <w:bookmarkStart w:id="38" w:name="финансирование"/>
     <w:p>
       <w:pPr>
         <w:pStyle w:val="Heading1"/>
@@ -3793,18 +3415,18 @@
           <wp:inline>
             <wp:extent cx="5334000" cy="5129623"/>
             <wp:effectExtent b="0" l="0" r="0" t="0"/>
-            <wp:docPr descr="image" title="" id="25" name="Picture"/>
+            <wp:docPr descr="image" title="" id="24" name="Picture"/>
             <a:graphic>
               <a:graphicData uri="http://schemas.openxmlformats.org/drawingml/2006/picture">
                 <pic:pic>
                   <pic:nvPicPr>
-                    <pic:cNvPr descr="figures/ru_fig1_scheme_draw.png" id="26" name="Picture"/>
+                    <pic:cNvPr descr="figures/ru_fig1_scheme_draw.png" id="25" name="Picture"/>
                     <pic:cNvPicPr>
                       <a:picLocks noChangeArrowheads="1" noChangeAspect="1"/>
                     </pic:cNvPicPr>
                   </pic:nvPicPr>
                   <pic:blipFill>
-                    <a:blip r:embed="rId24"/>
+                    <a:blip r:embed="rId23"/>
                     <a:stretch>
                       <a:fillRect/>
                     </a:stretch>
@@ -3882,18 +3504,18 @@
           <wp:inline>
             <wp:extent cx="4533900" cy="3664283"/>
             <wp:effectExtent b="0" l="0" r="0" t="0"/>
-            <wp:docPr descr="image" title="" id="28" name="Picture"/>
+            <wp:docPr descr="image" title="" id="27" name="Picture"/>
             <a:graphic>
               <a:graphicData uri="http://schemas.openxmlformats.org/drawingml/2006/picture">
                 <pic:pic>
                   <pic:nvPicPr>
-                    <pic:cNvPr descr="figures/ru_fig2_matrix.png" id="29" name="Picture"/>
+                    <pic:cNvPr descr="figures/ru_fig2_matrix.png" id="28" name="Picture"/>
                     <pic:cNvPicPr>
                       <a:picLocks noChangeArrowheads="1" noChangeAspect="1"/>
                     </pic:cNvPicPr>
                   </pic:nvPicPr>
                   <pic:blipFill>
-                    <a:blip r:embed="rId27"/>
+                    <a:blip r:embed="rId26"/>
                     <a:stretch>
                       <a:fillRect/>
                     </a:stretch>
@@ -3945,18 +3567,18 @@
           <wp:inline>
             <wp:extent cx="5334000" cy="2496486"/>
             <wp:effectExtent b="0" l="0" r="0" t="0"/>
-            <wp:docPr descr="image" title="" id="31" name="Picture"/>
+            <wp:docPr descr="image" title="" id="30" name="Picture"/>
             <a:graphic>
               <a:graphicData uri="http://schemas.openxmlformats.org/drawingml/2006/picture">
                 <pic:pic>
                   <pic:nvPicPr>
-                    <pic:cNvPr descr="figures/ru_fig3_decay.png" id="32" name="Picture"/>
+                    <pic:cNvPr descr="figures/ru_fig3_decay.png" id="31" name="Picture"/>
                     <pic:cNvPicPr>
                       <a:picLocks noChangeArrowheads="1" noChangeAspect="1"/>
                     </pic:cNvPicPr>
                   </pic:nvPicPr>
                   <pic:blipFill>
-                    <a:blip r:embed="rId30"/>
+                    <a:blip r:embed="rId29"/>
                     <a:stretch>
                       <a:fillRect/>
                     </a:stretch>
@@ -4075,18 +3697,18 @@
           <wp:inline>
             <wp:extent cx="3733800" cy="3454895"/>
             <wp:effectExtent b="0" l="0" r="0" t="0"/>
-            <wp:docPr descr="image" title="" id="34" name="Picture"/>
+            <wp:docPr descr="image" title="" id="33" name="Picture"/>
             <a:graphic>
               <a:graphicData uri="http://schemas.openxmlformats.org/drawingml/2006/picture">
                 <pic:pic>
                   <pic:nvPicPr>
-                    <pic:cNvPr descr="figures/ru_fig4_tiles.png" id="35" name="Picture"/>
+                    <pic:cNvPr descr="figures/ru_fig4_tiles.png" id="34" name="Picture"/>
                     <pic:cNvPicPr>
                       <a:picLocks noChangeArrowheads="1" noChangeAspect="1"/>
                     </pic:cNvPicPr>
                   </pic:nvPicPr>
                   <pic:blipFill>
-                    <a:blip r:embed="rId33"/>
+                    <a:blip r:embed="rId32"/>
                     <a:stretch>
                       <a:fillRect/>
                     </a:stretch>
@@ -4138,18 +3760,18 @@
           <wp:inline>
             <wp:extent cx="3733800" cy="3227829"/>
             <wp:effectExtent b="0" l="0" r="0" t="0"/>
-            <wp:docPr descr="image" title="" id="37" name="Picture"/>
+            <wp:docPr descr="image" title="" id="36" name="Picture"/>
             <a:graphic>
               <a:graphicData uri="http://schemas.openxmlformats.org/drawingml/2006/picture">
                 <pic:pic>
                   <pic:nvPicPr>
-                    <pic:cNvPr descr="figures/ru_fig5_P_vs_h.png" id="38" name="Picture"/>
+                    <pic:cNvPr descr="figures/ru_fig5_P_vs_h.png" id="37" name="Picture"/>
                     <pic:cNvPicPr>
                       <a:picLocks noChangeArrowheads="1" noChangeAspect="1"/>
                     </pic:cNvPicPr>
                   </pic:nvPicPr>
                   <pic:blipFill>
-                    <a:blip r:embed="rId36"/>
+                    <a:blip r:embed="rId35"/>
                     <a:stretch>
                       <a:fillRect/>
                     </a:stretch>
@@ -4309,7 +3931,7 @@
           <w:rFonts w:ascii="Times New Roman" w:hAnsi="Times New Roman"/>
           <w:sz w:val="24"/>
         </w:rPr>
-        <w:t xml:space="preserve">The atmospheric circulation is organised as a hierarchy: eddies of hundreds of kilometres live inside cyclones and anticyclones of thousands of kilometres, and eddies of tens of kilometres live inside them. The two previous papers of the series showed that the consistency of placement of adjacent levels of this hierarchy (inter-level coupling) is a stable property of territory and mapped it globally. The aim of this paper is to establish the rule by which the levels are related and to give the map a single explanation. Using the 850-hPa relative vorticity of the ERA5 reanalysis (2023–2024), the beyond-spectrum consistency of placement was measured for all pairs of levels from 50 to 1600 km in twelve 2000 by 2800 km regions and in 902 cells of a global grid. A simple law was found: the consistency of two levels depends only on the coarser of them and not on how fine the second is; each coarse level passes the same placement pattern to every level below it. The law holds in all 902 cells, is independent of the region size and of the circulation regime, and is reproduced by a climate-model run without data assimilation, hence it is a property of the atmosphere. The coupling of adjacent levels is the normalised strength of this inheritance. Territories differ not in the structure of the hierarchy, which is the same everywhere, but in the strength of inheritance; its map is the coupling map. Three stronger claims – an inheritance depth, a mechanism, and a budget of inherited and own variability – are shown not to be supported by the data. The law gives the global map a single basis and allows it to be used in regionalisation as a property of the circulation structure.</w:t>
+        <w:t xml:space="preserve">The atmospheric circulation is organised as a hierarchy: eddies of hundreds of kilometres live inside cyclones and anticyclones of thousands of kilometres, and eddies of tens of kilometres live inside them. The two previous papers of the series showed that the consistency of placement of adjacent levels of this hierarchy (inter-level coupling) is a stable property of territory and mapped it globally. The aim of this paper is to establish the rule by which the levels are related and to give the map a single explanation. Using the 850-hPa relative vorticity of the ERA5 reanalysis (2023–2024), the beyond-spectrum consistency of placement was measured for all pairs of levels from 50 to 1600 km in twelve 2000 by 2800 km regions and in 902 cells of a global grid. A simple law was found: the consistency of two levels depends only on the coarser of them and not on how fine the second is; each coarse level passes the same placement pattern to every level below it. The law holds in all 902 cells, is independent of the region size and of the circulation regime, and is reproduced by a climate-model run without data assimilation, hence it is a property of the atmosphere. The coupling of adjacent levels is the normalised strength of this inheritance. Territories differ not in the structure of the hierarchy, which is the same everywhere, but in the strength of inheritance; its map is the coupling map. The law gives the global map a single basis and allows it to be used in regionalisation as a property of the circulation structure.</w:t>
       </w:r>
     </w:p>
     <w:p>
@@ -4340,7 +3962,7 @@
         <w:t xml:space="preserve">hierarchy of geosystems, scale levels, inter-level links, cascade, invariant, reanalysis, model run, extratropical cyclones, deep convection, regionalisation.</w:t>
       </w:r>
     </w:p>
-    <w:bookmarkEnd w:id="39"/>
+    <w:bookmarkEnd w:id="38"/>
     <w:sectPr>
       <w:footnotePr>
         <w:numRestart w:val="eachSect"/>

</xml_diff>

<commit_message>
Article 3 v2: rebuild after typography fix (journal quotes)
Co-Authored-By: Claude Fable 5.1 <noreply@anthropic.com>
</commit_message>
<xml_diff>
--- a/manuscript_v2/article3/article3_v2.docx
+++ b/manuscript_v2/article3/article3_v2.docx
@@ -109,7 +109,7 @@
           <w:rFonts w:ascii="Times New Roman" w:hAnsi="Times New Roman"/>
           <w:sz w:val="24"/>
         </w:rPr>
-        <w:t xml:space="preserve">Атмосферная циркуляция устроена как иерархия: внутри циклонов и антициклонов размером в тысячи километров живут вихри в сотни километров, а внутри них – вихри в десятки километров. В двух предыдущих статьях серии показано, что согласованность размещения соседних уровней этой иерархии (сопряженность уровней) – устойчивая характеристика территории, и построена ее планетарная карта. Цель настоящей работы – установить, по какому правилу связаны между собой уровни иерархии, и дать карте сопряженности единое объяснение. По полю относительного вихря на поверхности 850 гПа (реанализ ERA5, 2023–2024 гг.) для двенадцати областей размером 2000 на 2800 км и для 902 ячеек планетарной сетки измерена согласованность размещения всех пар уровней от 50 до 1600 км сверх той, что задана спектром поля. Найден простой закон: согласованность двух уровней зависит только от более крупного из них и не зависит от того, насколько мелок второй. Иначе говоря, каждый крупный уровень передает один и тот же рисунок размещения всем уровням ниже себя. Закон выполняется во всех 902 ячейках, не зависит от размера области и от режима циркуляции и воспроизводится в модельном расчете без усвоения наблюдений, то есть отражает свойство атмосферы. Сопряженность соседних уровней оказывается нормированной силой этого наследования. Территории различаются не устройством иерархии, которое везде одно, а силой наследования; ее карта и есть карта сопряженности. Закон дает планетарной карте единое основание и позволяет использовать ее в районировании как характеристику устройства циркуляции.</w:t>
+        <w:t xml:space="preserve">Атмосферная циркуляция устроена как иерархия: внутри циклонов и антициклонов размером в тысячи километров живут вихри в сотни километров, а внутри них – вихри в десятки километров. В двух предыдущих статьях серии показано, что согласованность размещения соседних уровней этой иерархии (сопряженность уровней) – устойчивая характеристика территории, и построена ее планетарная карта. Цель настоящей работы – установить, по какому правилу связаны между собой уровни иерархии, и дать карте сопряженности единое объяснение. По полю относительного вихря на поверхности 850 гПа (реанализ ERA5, 2023–2024 гг.) для двенадцати областей размером 2000 на 2800 км и для 902 ячеек планетарной сетки измерена согласованность размещения всех пар уровней от 50 до 1600 км сверх той, что задана спектром поля. Найден простой закон: согласованность двух уровней зависит только от более крупного из них и не зависит от того, насколько мелок второй. Иначе говоря, каждый крупный уровень передает один и тот же рисунок размещения всем уровням ниже себя. Закон выполняется во всех 902 ячейках, не зависит от размера области и от режима циркуляции и воспроизводится в модельном расчете без усвоения наблюдений, то есть не сводится к особенностям реанализа и указывает на свойство атмосферной динамики. Сопряженность соседних уровней оказывается нормированной силой этого наследования. В исследованном диапазоне размеров территории различаются не устройством иерархии, а силой наследования; ее карта и есть карта сопряженности. Закон дает планетарной карте единое основание и позволяет использовать ее в районировании как характеристику устройства циркуляции.</w:t>
       </w:r>
     </w:p>
     <w:p>
@@ -162,7 +162,7 @@
           <w:rFonts w:ascii="Times New Roman" w:hAnsi="Times New Roman"/>
           <w:sz w:val="24"/>
         </w:rPr>
-        <w:t xml:space="preserve">Круговорот воды можно объяснить ребенку: вода испаряется, поднимается, собирается в облака и выпадает дождем. Устройство атмосферной циркуляции объяснить так же просто пока не удается, хотя ее главное свойство не сложнее. Циркуляция устроена как лестница размеров. На верхней ступени – циклоны и антициклоны в тысячи километров. Внутри них – вихри и полосы облаков в сотни километров. Внутри тех – вихри в десятки километров, и так до отдельных облаков. Каждая ступень этой лестницы изучена по отдельности: известно, где и как часто возникают циклоны (Chang et al., 2002; Hoskins, Hodges, 2005; Hoskins, Valdes, 1990), где сосредоточена глубокая конвекция (Feng et al., 2021; Houze, 2004), как распределена энергия по размерам (Nastrom, Gage, 1985). Гораздо меньше известно о том, как ступени связаны друг с другом: повторяют ли мелкие вихри рисунок крупных или размещаются независимо от них.</w:t>
+        <w:t xml:space="preserve">Атмосферная циркуляция устроена как лестница размеров. На верхней ступени – циклоны и антициклоны в тысячи километров. Внутри них – вихри и полосы облаков в сотни километров. Внутри тех – вихри в десятки километров, и так до отдельных облаков. Каждая ступень этой лестницы изучена по отдельности: известно, где и как часто возникают циклоны (Chang et al., 2002; Hoskins, Hodges, 2005; Hoskins, Valdes, 1990), где сосредоточена глубокая конвекция (Feng et al., 2021; Houze, 2004), как распределена энергия по размерам (Nastrom, Gage, 1985). Гораздо меньше известно о том, как ступени связаны друг с другом: повторяют ли мелкие вихри рисунок крупных или размещаются независимо от них.</w:t>
       </w:r>
     </w:p>
     <w:p>
@@ -234,7 +234,7 @@
           <w:rFonts w:ascii="Times New Roman" w:hAnsi="Times New Roman"/>
           <w:sz w:val="24"/>
         </w:rPr>
-        <w:t xml:space="preserve">– согласованность размещения изменчивости двух соседних уровней сверх той, что задана спектром поля. Показано, что</w:t>
+        <w:t xml:space="preserve">– согласованность размещения изменчивости двух соседних уровней сверх той, что задана спектром поля; сопряженность есть характеристика одновременного размещения, а не переноса энергии или причинного воздействия между уровнями. Показано, что</w:t>
       </w:r>
       <w:r>
         <w:rPr>
@@ -711,7 +711,7 @@
           <w:rFonts w:ascii="Times New Roman" w:hAnsi="Times New Roman"/>
           <w:sz w:val="24"/>
         </w:rPr>
-        <w:t xml:space="preserve">Важно, что для несоседних уровней суррогатная поправка почти не нужна: полосы не перекрываются, и согласованность у случайно-фазовых полей близка к нулю (0.16 через одну ступень, 0.02 через две, менее 0.01 через четыре), тогда как у наблюденных полей она равна 0.64, 0.41, 0.21 и 0.10. Иначе говоря, связь между далекими уровнями видна в исходных данных без всякой обработки. Для соседних уровней, напротив, наблюденная корреляция 0.87 на две трети состоит из перекрытия полос. Отсюда следует, что мелкие вихри повторяют рисунок не только ближайшего крупного уровня, но и всех уровней выше него, вплоть до масштаба циклонов.</w:t>
+        <w:t xml:space="preserve">Важно, что для несоседних уровней суррогатная поправка почти не нужна: полосы не перекрываются, и согласованность у случайно-фазовых полей близка к нулю (0.16 через одну ступень, 0.02 через две, менее 0.01 через четыре), тогда как у наблюденных полей она равна 0.64, 0.41, 0.21 и 0.10. Иначе говоря, связь между далекими уровнями видна в исходных данных без всякой обработки. Для соседних уровней, напротив, наблюденная корреляция 0.87 на две трети состоит из перекрытия полос. Отсюда следует, что изменчивость мелкого уровня воспроизводит пространственный рисунок не только ближайшего крупного уровня, но и всех уровней выше него, вплоть до масштаба циклонов.</w:t>
       </w:r>
     </w:p>
     <w:bookmarkEnd w:id="12"/>
@@ -869,7 +869,7 @@
           <w:rFonts w:ascii="Times New Roman" w:hAnsi="Times New Roman"/>
           <w:sz w:val="24"/>
         </w:rPr>
-        <w:t xml:space="preserve">): устройство иерархии одинаково в тропиках и в умеренных широтах, над сушей и над океаном.</w:t>
+        <w:t xml:space="preserve">): в исследованном диапазоне размеров устройство иерархии одинаково в тропиках и в умеренных широтах, над сушей и над океаном.</w:t>
       </w:r>
     </w:p>
     <w:p>
@@ -881,7 +881,35 @@
           <w:rFonts w:ascii="Times New Roman" w:hAnsi="Times New Roman"/>
           <w:sz w:val="24"/>
         </w:rPr>
-        <w:t xml:space="preserve">В словесной форме закон таков. Каждый крупный уровень передает всем уровням ниже себя один и тот же рисунок размещения, а мелкий уровень получает свой рисунок от всех уровней выше себя. Согласованность двух уровней – это доля общего для них рисунка, унаследованного от их общего крупного уровня. В формульной записи: если</w:t>
+        <w:t xml:space="preserve">В словесной форме закон таков. Каждый крупный уровень передает всем уровням ниже себя один и тот же рисунок размещения, а мелкий уровень получает свой рисунок от всех уровней выше себя; согласованность двух уровней – это общая для них часть рисунка, унаследованная от их общего крупного уровня. Здесь и далее</w:t>
+      </w:r>
+      <w:r>
+        <w:rPr>
+          <w:rFonts w:ascii="Times New Roman" w:hAnsi="Times New Roman"/>
+          <w:sz w:val="24"/>
+        </w:rPr>
+        <w:t xml:space="preserve"> </w:t>
+      </w:r>
+      <w:r>
+        <w:rPr>
+          <w:rFonts w:ascii="Times New Roman" w:hAnsi="Times New Roman"/>
+          <w:sz w:val="24"/>
+        </w:rPr>
+        <w:t xml:space="preserve">“наследование”</w:t>
+      </w:r>
+      <w:r>
+        <w:rPr>
+          <w:rFonts w:ascii="Times New Roman" w:hAnsi="Times New Roman"/>
+          <w:sz w:val="24"/>
+        </w:rPr>
+        <w:t xml:space="preserve"> </w:t>
+      </w:r>
+      <w:r>
+        <w:rPr>
+          <w:rFonts w:ascii="Times New Roman" w:hAnsi="Times New Roman"/>
+          <w:sz w:val="24"/>
+        </w:rPr>
+        <w:t xml:space="preserve">обозначает статистическое воспроизведение пространственного рисунка одного уровня на другом, а не установленный физический процесс переноса энергии или причинного воздействия: измеряется одновременное размещение уровней, и направления передачи оно не задает. В формульной записи: если</w:t>
       </w:r>
       <w:r>
         <w:rPr>
@@ -1290,7 +1318,7 @@
           <w:rFonts w:ascii="Times New Roman" w:hAnsi="Times New Roman"/>
           <w:sz w:val="24"/>
         </w:rPr>
-        <w:t xml:space="preserve">Найденное правило могло быть свойством способа измерения, а не атмосферы. Три проверки это исключают. Во-первых, при уменьшении сторон областей до 0.7 исходных форма зависимости</w:t>
+        <w:t xml:space="preserve">Найденное правило могло быть свойством способа измерения или реанализа, а не атмосферы. Три проверки говорят против этого. Во-первых, при уменьшении сторон областей до 0.7 исходных форма зависимости</w:t>
       </w:r>
       <w:r>
         <w:rPr>
@@ -1331,7 +1359,7 @@
           <w:rFonts w:ascii="Times New Roman" w:hAnsi="Times New Roman"/>
           <w:sz w:val="24"/>
         </w:rPr>
-        <w:t xml:space="preserve">не меняется: отношение значений, полученных на малых и на исходных областях, составляет 0.93–1.02 по всем двенадцати областям; меняется лишь общий уровень ковариаций (в среднем на 20 % ниже), то есть амплитуда, но не устройство. Во-вторых, закон выполняется в свободном расчете климатической модели, которая не использует наблюдений: разность двух описаний составляет 0.62–0.78 во всех двенадцати областях (</w:t>
+        <w:t xml:space="preserve">не меняется: отношение значений, полученных на малых и на исходных областях, составляет 0.93–1.02 по всем двенадцати областям; меняется лишь общий уровень ковариаций (в среднем на 20 % ниже). Во-вторых, закон выполняется в свободном расчете климатической модели, которая не использует наблюдений: разность двух описаний составляет 0.62–0.78 во всех двенадцати областях (</w:t>
       </w:r>
       <m:oMath>
         <m:r>
@@ -1972,7 +2000,7 @@
           <w:rFonts w:ascii="Times New Roman" w:hAnsi="Times New Roman"/>
           <w:sz w:val="24"/>
         </w:rPr>
-        <w:t xml:space="preserve">, а закон дает ей содержание.</w:t>
+        <w:t xml:space="preserve">.</w:t>
       </w:r>
     </w:p>
     <w:p>
@@ -2216,7 +2244,7 @@
           <w:rFonts w:ascii="Times New Roman" w:hAnsi="Times New Roman"/>
           <w:sz w:val="24"/>
         </w:rPr>
-        <w:t xml:space="preserve">. Иначе говоря, перемежаемость огибающих, которая в статье II выглядела отдельным фактором, есть проявление того же наследования.</w:t>
+        <w:t xml:space="preserve">.</w:t>
       </w:r>
     </w:p>
     <w:bookmarkEnd w:id="15"/>
@@ -2256,33 +2284,7 @@
           <w:rFonts w:ascii="Times New Roman" w:hAnsi="Times New Roman"/>
           <w:sz w:val="24"/>
         </w:rPr>
-        <w:t xml:space="preserve">Найденный закон соединяет три статьи серии в одно рассуждение. Устройство иерархии атмосферной циркуляции на размерах от 50 до 1600 км везде одно: каждый крупный уровень передает всем уровням ниже себя один и тот же рисунок размещения, и согласованность двух уровней задана их общим крупным уровнем. Территории различаются не устройством, а силой наследования – тем, насколько велика унаследованная часть рисунка по сравнению с общей изменчивостью. Сопряженность соседних уровней</w:t>
-      </w:r>
-      <w:r>
-        <w:rPr>
-          <w:rFonts w:ascii="Times New Roman" w:hAnsi="Times New Roman"/>
-          <w:sz w:val="24"/>
-        </w:rPr>
-        <w:t xml:space="preserve"> </w:t>
-      </w:r>
-      <m:oMath>
-        <m:r>
-          <m:t>P</m:t>
-        </m:r>
-      </m:oMath>
-      <w:r>
-        <w:rPr>
-          <w:rFonts w:ascii="Times New Roman" w:hAnsi="Times New Roman"/>
-          <w:sz w:val="24"/>
-        </w:rPr>
-        <w:t xml:space="preserve"> </w:t>
-      </w:r>
-      <w:r>
-        <w:rPr>
-          <w:rFonts w:ascii="Times New Roman" w:hAnsi="Times New Roman"/>
-          <w:sz w:val="24"/>
-        </w:rPr>
-        <w:t xml:space="preserve">– нормированная мера этой силы; ее карта (статья II) – карта силы наследования. Пути внетропических циклонов – территории, где наследование сильно; очаги глубокой конвекции – где оно слабо; конвекция и активность циклонов, найденные в статье II как факторы карты, суть факторы амплитуды закона, а не его формы. Перемежаемость огибающих, входившая в статье II в число факторов, оказывается проявлением того же наследования.</w:t>
+        <w:t xml:space="preserve">Найденный закон соединяет три статьи серии в одно рассуждение. На исследованных носителях и в диапазоне размеров от 50 до 1600 км устройство иерархии одно и то же, а территории различаются силой наследования – тем, насколько велика унаследованная часть рисунка по сравнению с общей изменчивостью; карта сопряженности (статья II) – карта этой силы. Пути внетропических циклонов – территории, где наследование сильно; очаги глубокой конвекции – где оно слабо; конвекция и активность циклонов, найденные в статье II как факторы карты, суть факторы амплитуды закона, а не его формы. Перемежаемость огибающих, входившая в статье II в число факторов, оказывается проявлением того же наследования.</w:t>
       </w:r>
     </w:p>
     <w:p>
@@ -2294,7 +2296,7 @@
           <w:rFonts w:ascii="Times New Roman" w:hAnsi="Times New Roman"/>
           <w:sz w:val="24"/>
         </w:rPr>
-        <w:t xml:space="preserve">Закон описывает устройство иерархии, но не отвечает на вопрос, почему сила наследования распределена по планете именно так. Известно лишь, с чем она связана статистически: с активностью внетропических циклонов и с глубокой конвекцией (статья II). Проверка двух правдоподобных объяснений – растяжения воздуха внутри циклонов, которое должно было бы привязывать мелкие вихри к крупным (Hoskins, Bretherton, 1972), и глубокой конвекции, которая должна была бы размещать их независимо от крупных (Craig, Cohen, 2006), – показала, что растяжение воздуха есть везде и одинаково, а различий между территориями не несет. Механизм распределения амплитуды по карте остается предметом будущих исследований. Установленное здесь – что закон выполняется без исключений на всех носителях, включая модельный расчет без усвоения наблюдений, и не зависит от режима циркуляции, – позволяет говорить об устройстве иерархии как о свойстве атмосферы, а не наблюдательной системы или способа измерения.</w:t>
+        <w:t xml:space="preserve">Закон описывает устройство иерархии, но не отвечает на вопрос, почему сила наследования распределена по планете именно так. Известно лишь, с чем она связана статистически: с активностью внетропических циклонов и с глубокой конвекцией (статья II). Проверка двух правдоподобных объяснений – растяжения воздуха внутри циклонов, которое должно было бы привязывать мелкомасштабную изменчивость к крупной (Hoskins, Bretherton, 1972), и глубокой конвекции, которая должна была бы размещать ее независимо от крупной (Craig, Cohen, 2006), – показала, что растяжение воздуха есть везде и одинаково, а различий между территориями не несет. Механизм распределения амплитуды по карте остается предметом будущих исследований. Установленное здесь – что закон выполняется без исключений на всех носителях, включая модельный расчет без усвоения наблюдений, и не зависит от режима циркуляции, – указывает на свойство атмосферной динамики, не сводимое к особенностям реанализа или способа измерения.</w:t>
       </w:r>
     </w:p>
     <w:bookmarkEnd w:id="17"/>
@@ -2335,7 +2337,7 @@
           <w:rFonts w:ascii="Times New Roman" w:hAnsi="Times New Roman"/>
           <w:sz w:val="24"/>
         </w:rPr>
-        <w:t xml:space="preserve">) установлен для динамического поля атмосферы на планете в целом, показано, что его форма не зависит от территории, и что известная ранее сопряженность соседних уровней есть его нормированная амплитуда. Тем самым сопряженность получает место в теории иерархических систем: это первая измеренная для атмосферы характеристика связи между уровнями – того, что в ландшафтоведении называют межуровневыми связями (Хорошев, 2016) и оценивают как долю свойств участка, заданную геосистемами высшего ранга (Хорошев и др., 2010), а в общей теории иерархий – как степень почти-разложимости (Simon, 1962). Оговорка обязательна: закон и его амплитуда – статистические характеристики одновременного размещения уровней; они не описывают ни направления передачи, ни переноса энергии между уровнями (статья I).</w:t>
+        <w:t xml:space="preserve">) установлен для динамического поля атмосферы на планете в целом и связан с ранее введенной сопряженностью уровней. Тем самым сопряженность получает место в теории иерархических систем: это первая измеренная для атмосферы характеристика связи между уровнями – того, что в ландшафтоведении называют межуровневыми связями (Хорошев, 2016) и оценивают как долю свойств участка, заданную геосистемами высшего ранга (Хорошев и др., 2010), а в общей теории иерархий – как степень почти-разложимости (Simon, 1962).</w:t>
       </w:r>
     </w:p>
     <w:bookmarkEnd w:id="18"/>
@@ -2361,7 +2363,7 @@
           <w:rFonts w:ascii="Times New Roman" w:hAnsi="Times New Roman"/>
           <w:sz w:val="24"/>
         </w:rPr>
-        <w:t xml:space="preserve">Для районирования закон дает три вещи. Во-первых, основание: карта сопряженности делит территории по характеристике устройства циркуляции, а не по среднему состоянию, как схемы климатического районирования (Исаченко, 1991), и это устройство подчиняется простому закону. Во-вторых, экономию: поскольку форма закона везде одна, территория описывается одним числом – силой наследования; несколько статистик перемежаемости, которые пришлось бы вводить иначе, заменяются одной. В-третьих, единицу сравнения: две территории с одинаковой силой наследования устроены одинаково на всех уровнях от 50 до 1600 км, что дает основание выбирать территории-аналоги для региональных исследований мезомасштабных процессов. Схема районирования статьи II при этом не меняется: закон не переопределяет карту, а объясняет ее.</w:t>
+        <w:t xml:space="preserve">Для районирования закон дает три вещи. Во-первых, основание: карта сопряженности делит территории по характеристике устройства циркуляции, а не по среднему состоянию, как схемы климатического районирования (Исаченко, 1991), и это устройство подчиняется простому закону. Во-вторых, экономию: территория описывается одним числом – силой наследования; несколько статистик перемежаемости, которые пришлось бы вводить иначе, заменяются одной. В-третьих, единицу сравнения: две территории с одинаковой силой наследования устроены одинаково на всех исследованных уровнях, что дает основание выбирать территории-аналоги для региональных исследований мезомасштабных процессов. Схема районирования статьи II при этом не меняется.</w:t>
       </w:r>
     </w:p>
     <w:bookmarkEnd w:id="19"/>
@@ -2480,7 +2482,7 @@
           <w:rFonts w:ascii="Times New Roman" w:hAnsi="Times New Roman"/>
           <w:sz w:val="24"/>
         </w:rPr>
-        <w:t xml:space="preserve">1. Согласованность размещения масштабных уровней атмосферной циркуляции не ограничена соседними уровнями: мелкие вихри повторяют рисунок всех уровней выше себя, вплоть до масштаба циклонов; для несоседних уровней связь видна в исходных данных без суррогатной поправки.</w:t>
+        <w:t xml:space="preserve">1. Согласованность размещения масштабных уровней атмосферной циркуляции не ограничена соседними уровнями: изменчивость мелкого уровня воспроизводит пространственный рисунок всех уровней выше него, вплоть до масштаба циклонов; для несоседних уровней связь видна в исходных данных без суррогатной поправки.</w:t>
       </w:r>
     </w:p>
     <w:p>
@@ -2492,7 +2494,7 @@
           <w:rFonts w:ascii="Times New Roman" w:hAnsi="Times New Roman"/>
           <w:sz w:val="24"/>
         </w:rPr>
-        <w:t xml:space="preserve">2. Установлен закон: сверхспектральная согласованность двух уровней зависит только от более крупного из них и не зависит от расстояния между уровнями. Каждый крупный уровень передает всем уровням ниже один и тот же рисунок размещения. Закон объясняет 99.6 % изменчивости согласованностей на двенадцати областях, выполняется в 100 % из 902 ячеек планетарной сетки, не зависит от размера области и режима циркуляции и воспроизводится в модельном расчете без усвоения наблюдений.</w:t>
+        <w:t xml:space="preserve">2. Установлен закон: сверхспектральная согласованность двух уровней зависит только от более крупного из них и не зависит от расстояния между уровнями. Каждый крупный уровень передает всем уровням ниже один и тот же рисунок размещения. Закон объясняет 99.6 % изменчивости согласованностей на двенадцати областях, выполняется в 100 % из 902 ячеек планетарной сетки, не зависит от размера области и режима циркуляции и воспроизводится в модельном расчете без усвоения наблюдений, то есть указывает на свойство атмосферной динамики.</w:t>
       </w:r>
     </w:p>
     <w:p>
@@ -2530,7 +2532,7 @@
           <w:rFonts w:ascii="Times New Roman" w:hAnsi="Times New Roman"/>
           <w:sz w:val="24"/>
         </w:rPr>
-        <w:t xml:space="preserve">первых двух статей есть нормированная сила наследования – амплитуда закона, отнесенная к общей изменчивости уровней. Ее карта – карта силы наследования. Территории различаются силой наследования, а не устройством иерархии, которое везде одно.</w:t>
+        <w:t xml:space="preserve">первых двух статей есть нормированная сила наследования – амплитуда закона, отнесенная к общей изменчивости уровней; в исследованном диапазоне территории различаются этой силой, а не устройством иерархии.</w:t>
       </w:r>
     </w:p>
     <w:p>
@@ -3931,7 +3933,7 @@
           <w:rFonts w:ascii="Times New Roman" w:hAnsi="Times New Roman"/>
           <w:sz w:val="24"/>
         </w:rPr>
-        <w:t xml:space="preserve">The atmospheric circulation is organised as a hierarchy: eddies of hundreds of kilometres live inside cyclones and anticyclones of thousands of kilometres, and eddies of tens of kilometres live inside them. The two previous papers of the series showed that the consistency of placement of adjacent levels of this hierarchy (inter-level coupling) is a stable property of territory and mapped it globally. The aim of this paper is to establish the rule by which the levels are related and to give the map a single explanation. Using the 850-hPa relative vorticity of the ERA5 reanalysis (2023–2024), the beyond-spectrum consistency of placement was measured for all pairs of levels from 50 to 1600 km in twelve 2000 by 2800 km regions and in 902 cells of a global grid. A simple law was found: the consistency of two levels depends only on the coarser of them and not on how fine the second is; each coarse level passes the same placement pattern to every level below it. The law holds in all 902 cells, is independent of the region size and of the circulation regime, and is reproduced by a climate-model run without data assimilation, hence it is a property of the atmosphere. The coupling of adjacent levels is the normalised strength of this inheritance. Territories differ not in the structure of the hierarchy, which is the same everywhere, but in the strength of inheritance; its map is the coupling map. The law gives the global map a single basis and allows it to be used in regionalisation as a property of the circulation structure.</w:t>
+        <w:t xml:space="preserve">The atmospheric circulation is organised as a hierarchy: eddies of hundreds of kilometres live inside cyclones and anticyclones of thousands of kilometres, and eddies of tens of kilometres live inside them. The two previous papers of the series showed that the consistency of placement of adjacent levels of this hierarchy (inter-level coupling) is a stable property of territory and mapped it globally. The aim of this paper is to establish the rule by which the levels are related and to give the map a single explanation. Using the 850-hPa relative vorticity of the ERA5 reanalysis (2023–2024), the beyond-spectrum consistency of placement was measured for all pairs of levels from 50 to 1600 km in twelve 2000 by 2800 km regions and in 902 cells of a global grid. A simple law was found: the consistency of two levels depends only on the coarser of them and not on how fine the second is; each coarse level passes the same placement pattern to every level below it. The law holds in all 902 cells, is independent of the region size and of the circulation regime, and is reproduced by a climate-model run without data assimilation, hence it is not an artefact of the reanalysis and points to a property of the atmospheric dynamics. The coupling of adjacent levels is the normalised strength of this inheritance. Within the range of scales studied, territories differ not in the structure of the hierarchy but in the strength of inheritance; its map is the coupling map. The law gives the global map a single basis and allows it to be used in regionalisation as a property of the circulation structure.</w:t>
       </w:r>
     </w:p>
     <w:p>

</xml_diff>